<commit_message>
docs: expand multi-hunter section with per-hunter detail
Enrich section 4 with a per-hunter breakdown of all 14 hunters: methodology
referent, how each works, and prioritized patterns. Replaces the simple
two-column table with a detailed three-column reference for the 12 parallel
hunters and expanded descriptions of the 2 sequential hunters.

https://claude.ai/code/session_0133kZpmhw1xdgHYwQqPZR3o
</commit_message>
<xml_diff>
--- a/docs/Sistema-Bug-Bounty-Web3-Direccion.docx
+++ b/docs/Sistema-Bug-Bounty-Web3-Direccion.docx
@@ -1549,6 +1549,18 @@
     </w:p>
     <w:p>
       <w:pPr>
+        <w:spacing w:after="120"/>
+      </w:pPr>
+      <w:r>
+        <w:rPr>
+          <w:i w:val="0"/>
+          <w:sz w:val="21"/>
+        </w:rPr>
+        <w:t>Cada hunter está calibrado, cuando existe, con la metodología de un referente real del sector. Antes de emitir una hipótesis, cada agente aplica un auto-filtro: “¿por qué estaría equivocado?”. Esto reduce el ruido en origen. A continuación se describe qué hace cada uno y qué busca.</w:t>
+      </w:r>
+    </w:p>
+    <w:p>
+      <w:pPr>
         <w:keepNext/>
         <w:spacing w:before="240" w:after="80"/>
       </w:pPr>
@@ -1569,13 +1581,14 @@
         <w:tblLook w:firstColumn="1" w:firstRow="1" w:lastColumn="0" w:lastRow="0" w:noHBand="0" w:noVBand="1" w:val="04A0"/>
       </w:tblPr>
       <w:tblGrid>
-        <w:gridCol w:w="4680"/>
-        <w:gridCol w:w="4680"/>
+        <w:gridCol w:w="3120"/>
+        <w:gridCol w:w="3120"/>
+        <w:gridCol w:w="3120"/>
       </w:tblGrid>
       <w:tr>
         <w:tc>
           <w:tcPr>
-            <w:tcW w:type="dxa" w:w="2448"/>
+            <w:tcW w:type="dxa" w:w="1944"/>
             <w:shd w:val="clear" w:color="auto" w:fill="1F6FB2"/>
             <w:tcMar>
               <w:top w:w="60" w:type="dxa"/>
@@ -1592,7 +1605,7 @@
               <w:rPr>
                 <w:b/>
                 <w:color w:val="FFFFFF"/>
-                <w:sz w:val="19"/>
+                <w:sz w:val="17"/>
               </w:rPr>
               <w:t>Hunter</w:t>
             </w:r>
@@ -1600,7 +1613,7 @@
         </w:tc>
         <w:tc>
           <w:tcPr>
-            <w:tcW w:type="dxa" w:w="5760"/>
+            <w:tcW w:type="dxa" w:w="1512"/>
             <w:shd w:val="clear" w:color="auto" w:fill="1F6FB2"/>
             <w:tcMar>
               <w:top w:w="60" w:type="dxa"/>
@@ -1617,9 +1630,34 @@
               <w:rPr>
                 <w:b/>
                 <w:color w:val="FFFFFF"/>
-                <w:sz w:val="19"/>
+                <w:sz w:val="17"/>
               </w:rPr>
-              <w:t>Especialidad</w:t>
+              <w:t>Referente</w:t>
+            </w:r>
+          </w:p>
+        </w:tc>
+        <w:tc>
+          <w:tcPr>
+            <w:tcW w:type="dxa" w:w="4752"/>
+            <w:shd w:val="clear" w:color="auto" w:fill="1F6FB2"/>
+            <w:tcMar>
+              <w:top w:w="60" w:type="dxa"/>
+              <w:bottom w:w="60" w:type="dxa"/>
+              <w:start w:w="100" w:type="dxa"/>
+              <w:end w:w="100" w:type="dxa"/>
+            </w:tcMar>
+          </w:tcPr>
+          <w:p>
+            <w:pPr>
+              <w:jc w:val="left"/>
+            </w:pPr>
+            <w:r>
+              <w:rPr>
+                <w:b/>
+                <w:color w:val="FFFFFF"/>
+                <w:sz w:val="17"/>
+              </w:rPr>
+              <w:t>Cómo trabaja y qué patrones prioriza</w:t>
             </w:r>
           </w:p>
         </w:tc>
@@ -1627,7 +1665,7 @@
       <w:tr>
         <w:tc>
           <w:tcPr>
-            <w:tcW w:type="dxa" w:w="2448"/>
+            <w:tcW w:type="dxa" w:w="1944"/>
             <w:tcMar>
               <w:top w:w="60" w:type="dxa"/>
               <w:bottom w:w="60" w:type="dxa"/>
@@ -1640,15 +1678,15 @@
               <w:rPr>
                 <w:b/>
                 <w:color w:val="102A43"/>
-                <w:sz w:val="19"/>
+                <w:sz w:val="17"/>
               </w:rPr>
-              <w:t>AccessHunter</w:t>
+              <w:t>MathHunter</w:t>
             </w:r>
           </w:p>
         </w:tc>
         <w:tc>
           <w:tcPr>
-            <w:tcW w:type="dxa" w:w="5760"/>
+            <w:tcW w:type="dxa" w:w="1512"/>
             <w:tcMar>
               <w:top w:w="60" w:type="dxa"/>
               <w:bottom w:w="60" w:type="dxa"/>
@@ -1659,9 +1697,28 @@
           <w:p>
             <w:r>
               <w:rPr>
-                <w:sz w:val="19"/>
+                <w:sz w:val="17"/>
               </w:rPr>
-              <w:t>Control de acceso, escalada de privilegios, inicializadores desprotegidos</w:t>
+              <w:t>Trust</w:t>
+            </w:r>
+          </w:p>
+        </w:tc>
+        <w:tc>
+          <w:tcPr>
+            <w:tcW w:type="dxa" w:w="4752"/>
+            <w:tcMar>
+              <w:top w:w="60" w:type="dxa"/>
+              <w:bottom w:w="60" w:type="dxa"/>
+              <w:start w:w="100" w:type="dxa"/>
+              <w:end w:w="100" w:type="dxa"/>
+            </w:tcMar>
+          </w:tcPr>
+          <w:p>
+            <w:r>
+              <w:rPr>
+                <w:sz w:val="17"/>
+              </w:rPr>
+              <w:t>Identifica el invariante económico central y enumera todas las formas de alterar los activos sin alterar las participaciones (shares). Solo valida si hay pérdida concreta mayor que el coste del ataque. Patrones: truncación de redondeo acumulativa, donation attacks, deriva en el cálculo de intereses, inflación de shares, descuadres de comisiones.</w:t>
             </w:r>
           </w:p>
         </w:tc>
@@ -1669,7 +1726,7 @@
       <w:tr>
         <w:tc>
           <w:tcPr>
-            <w:tcW w:type="dxa" w:w="2448"/>
+            <w:tcW w:type="dxa" w:w="1944"/>
             <w:tcMar>
               <w:top w:w="60" w:type="dxa"/>
               <w:bottom w:w="60" w:type="dxa"/>
@@ -1683,15 +1740,15 @@
               <w:rPr>
                 <w:b/>
                 <w:color w:val="102A43"/>
-                <w:sz w:val="19"/>
+                <w:sz w:val="17"/>
               </w:rPr>
-              <w:t>MathHunter</w:t>
+              <w:t>AccessHunter</w:t>
             </w:r>
           </w:p>
         </w:tc>
         <w:tc>
           <w:tcPr>
-            <w:tcW w:type="dxa" w:w="5760"/>
+            <w:tcW w:type="dxa" w:w="1512"/>
             <w:tcMar>
               <w:top w:w="60" w:type="dxa"/>
               <w:bottom w:w="60" w:type="dxa"/>
@@ -1703,9 +1760,29 @@
           <w:p>
             <w:r>
               <w:rPr>
-                <w:sz w:val="19"/>
+                <w:sz w:val="17"/>
               </w:rPr>
-              <w:t>Accounting, redondeo, inflación de shares, donation attacks, deriva de interés</w:t>
+              <w:t>Mudit Gupta</w:t>
+            </w:r>
+          </w:p>
+        </w:tc>
+        <w:tc>
+          <w:tcPr>
+            <w:tcW w:type="dxa" w:w="4752"/>
+            <w:tcMar>
+              <w:top w:w="60" w:type="dxa"/>
+              <w:bottom w:w="60" w:type="dxa"/>
+              <w:start w:w="100" w:type="dxa"/>
+              <w:end w:w="100" w:type="dxa"/>
+            </w:tcMar>
+            <w:shd w:val="clear" w:color="auto" w:fill="EAF1F8"/>
+          </w:tcPr>
+          <w:p>
+            <w:r>
+              <w:rPr>
+                <w:sz w:val="17"/>
+              </w:rPr>
+              <w:t>Construye el grafo completo de privilegios del contrato y rastrea todos los caminos —directos e indirectos— que llevan a un rol privilegiado. Patrones: control de acceso ausente, escalada de privilegios, inicializadores desprotegidos, roles mal configurados en el despliegue.</w:t>
             </w:r>
           </w:p>
         </w:tc>
@@ -1713,7 +1790,7 @@
       <w:tr>
         <w:tc>
           <w:tcPr>
-            <w:tcW w:type="dxa" w:w="2448"/>
+            <w:tcW w:type="dxa" w:w="1944"/>
             <w:tcMar>
               <w:top w:w="60" w:type="dxa"/>
               <w:bottom w:w="60" w:type="dxa"/>
@@ -1726,7 +1803,7 @@
               <w:rPr>
                 <w:b/>
                 <w:color w:val="102A43"/>
-                <w:sz w:val="19"/>
+                <w:sz w:val="17"/>
               </w:rPr>
               <w:t>OracleHunter</w:t>
             </w:r>
@@ -1734,7 +1811,7 @@
         </w:tc>
         <w:tc>
           <w:tcPr>
-            <w:tcW w:type="dxa" w:w="5760"/>
+            <w:tcW w:type="dxa" w:w="1512"/>
             <w:tcMar>
               <w:top w:w="60" w:type="dxa"/>
               <w:bottom w:w="60" w:type="dxa"/>
@@ -1745,9 +1822,28 @@
           <w:p>
             <w:r>
               <w:rPr>
-                <w:sz w:val="19"/>
+                <w:sz w:val="17"/>
               </w:rPr>
-              <w:t>Manipulación de precios, TWAP insuficiente, staleness, arbitraje cross-DEX</w:t>
+              <w:t>samczsun</w:t>
+            </w:r>
+          </w:p>
+        </w:tc>
+        <w:tc>
+          <w:tcPr>
+            <w:tcW w:type="dxa" w:w="4752"/>
+            <w:tcMar>
+              <w:top w:w="60" w:type="dxa"/>
+              <w:bottom w:w="60" w:type="dxa"/>
+              <w:start w:w="100" w:type="dxa"/>
+              <w:end w:w="100" w:type="dxa"/>
+            </w:tcMar>
+          </w:tcPr>
+          <w:p>
+            <w:r>
+              <w:rPr>
+                <w:sz w:val="17"/>
+              </w:rPr>
+              <w:t>Localiza cada punto donde se consume un precio y traza hacia atrás hasta su fuente, preguntando: “¿puede manipularse en un solo bloque y con cuánto beneficio?”. Patrones: manipulación de precio spot, TWAP con ventana insuficiente, precios obsoletos (staleness), arbitraje cross-DEX.</w:t>
             </w:r>
           </w:p>
         </w:tc>
@@ -1755,7 +1851,7 @@
       <w:tr>
         <w:tc>
           <w:tcPr>
-            <w:tcW w:type="dxa" w:w="2448"/>
+            <w:tcW w:type="dxa" w:w="1944"/>
             <w:tcMar>
               <w:top w:w="60" w:type="dxa"/>
               <w:bottom w:w="60" w:type="dxa"/>
@@ -1769,7 +1865,7 @@
               <w:rPr>
                 <w:b/>
                 <w:color w:val="102A43"/>
-                <w:sz w:val="19"/>
+                <w:sz w:val="17"/>
               </w:rPr>
               <w:t>FlowHunter</w:t>
             </w:r>
@@ -1777,7 +1873,7 @@
         </w:tc>
         <w:tc>
           <w:tcPr>
-            <w:tcW w:type="dxa" w:w="5760"/>
+            <w:tcW w:type="dxa" w:w="1512"/>
             <w:tcMar>
               <w:top w:w="60" w:type="dxa"/>
               <w:bottom w:w="60" w:type="dxa"/>
@@ -1789,9 +1885,29 @@
           <w:p>
             <w:r>
               <w:rPr>
-                <w:sz w:val="19"/>
+                <w:sz w:val="17"/>
               </w:rPr>
-              <w:t>Reentrancy, callbacks de tokens, violaciones checks-effects-interactions</w:t>
+              <w:t>samczsun</w:t>
+            </w:r>
+          </w:p>
+        </w:tc>
+        <w:tc>
+          <w:tcPr>
+            <w:tcW w:type="dxa" w:w="4752"/>
+            <w:tcMar>
+              <w:top w:w="60" w:type="dxa"/>
+              <w:bottom w:w="60" w:type="dxa"/>
+              <w:start w:w="100" w:type="dxa"/>
+              <w:end w:w="100" w:type="dxa"/>
+            </w:tcMar>
+            <w:shd w:val="clear" w:color="auto" w:fill="EAF1F8"/>
+          </w:tcPr>
+          <w:p>
+            <w:r>
+              <w:rPr>
+                <w:sz w:val="17"/>
+              </w:rPr>
+              <w:t>Trata cada llamada externa como un punto de reentrada potencial y comprueba qué estado queda desincronizado en ese instante. Verifica el orden checks-effects-interactions. Patrones: reentrancy vía callback, cross-function, read-only, abuso de callbacks de tokens (ERC-777/721).</w:t>
             </w:r>
           </w:p>
         </w:tc>
@@ -1799,7 +1915,7 @@
       <w:tr>
         <w:tc>
           <w:tcPr>
-            <w:tcW w:type="dxa" w:w="2448"/>
+            <w:tcW w:type="dxa" w:w="1944"/>
             <w:tcMar>
               <w:top w:w="60" w:type="dxa"/>
               <w:bottom w:w="60" w:type="dxa"/>
@@ -1812,7 +1928,7 @@
               <w:rPr>
                 <w:b/>
                 <w:color w:val="102A43"/>
-                <w:sz w:val="19"/>
+                <w:sz w:val="17"/>
               </w:rPr>
               <w:t>DomainHunter</w:t>
             </w:r>
@@ -1820,7 +1936,7 @@
         </w:tc>
         <w:tc>
           <w:tcPr>
-            <w:tcW w:type="dxa" w:w="5760"/>
+            <w:tcW w:type="dxa" w:w="1512"/>
             <w:tcMar>
               <w:top w:w="60" w:type="dxa"/>
               <w:bottom w:w="60" w:type="dxa"/>
@@ -1831,9 +1947,28 @@
           <w:p>
             <w:r>
               <w:rPr>
-                <w:sz w:val="19"/>
+                <w:sz w:val="17"/>
               </w:rPr>
-              <w:t>Lógica específica del dominio (staking, gauges, epochs, swaps)</w:t>
+              <w:t>Variable según protocolo</w:t>
+            </w:r>
+          </w:p>
+        </w:tc>
+        <w:tc>
+          <w:tcPr>
+            <w:tcW w:type="dxa" w:w="4752"/>
+            <w:tcMar>
+              <w:top w:w="60" w:type="dxa"/>
+              <w:bottom w:w="60" w:type="dxa"/>
+              <w:start w:w="100" w:type="dxa"/>
+              <w:end w:w="100" w:type="dxa"/>
+            </w:tcMar>
+          </w:tcPr>
+          <w:p>
+            <w:r>
+              <w:rPr>
+                <w:sz w:val="17"/>
+              </w:rPr>
+              <w:t>Aplica la lógica específica del dominio activo (staking, gauges, DEX, bridges). En staking, por ejemplo: proporcionalidad de recompensas, bugs en los límites de epoch, staking con flash loan, drenaje de recompensas antes de que los usuarios las reclamen.</w:t>
             </w:r>
           </w:p>
         </w:tc>
@@ -1841,7 +1976,7 @@
       <w:tr>
         <w:tc>
           <w:tcPr>
-            <w:tcW w:type="dxa" w:w="2448"/>
+            <w:tcW w:type="dxa" w:w="1944"/>
             <w:tcMar>
               <w:top w:w="60" w:type="dxa"/>
               <w:bottom w:w="60" w:type="dxa"/>
@@ -1855,7 +1990,7 @@
               <w:rPr>
                 <w:b/>
                 <w:color w:val="102A43"/>
-                <w:sz w:val="19"/>
+                <w:sz w:val="17"/>
               </w:rPr>
               <w:t>TrustBoundaryHunter</w:t>
             </w:r>
@@ -1863,7 +1998,7 @@
         </w:tc>
         <w:tc>
           <w:tcPr>
-            <w:tcW w:type="dxa" w:w="5760"/>
+            <w:tcW w:type="dxa" w:w="1512"/>
             <w:tcMar>
               <w:top w:w="60" w:type="dxa"/>
               <w:bottom w:w="60" w:type="dxa"/>
@@ -1875,9 +2010,29 @@
           <w:p>
             <w:r>
               <w:rPr>
-                <w:sz w:val="19"/>
+                <w:sz w:val="17"/>
               </w:rPr>
-              <w:t>Fronteras de confianza entre contratos y dependencias externas</w:t>
+              <w:t>—</w:t>
+            </w:r>
+          </w:p>
+        </w:tc>
+        <w:tc>
+          <w:tcPr>
+            <w:tcW w:type="dxa" w:w="4752"/>
+            <w:tcMar>
+              <w:top w:w="60" w:type="dxa"/>
+              <w:bottom w:w="60" w:type="dxa"/>
+              <w:start w:w="100" w:type="dxa"/>
+              <w:end w:w="100" w:type="dxa"/>
+            </w:tcMar>
+            <w:shd w:val="clear" w:color="auto" w:fill="EAF1F8"/>
+          </w:tcPr>
+          <w:p>
+            <w:r>
+              <w:rPr>
+                <w:sz w:val="17"/>
+              </w:rPr>
+              <w:t>Examina las fronteras de confianza entre el contrato y sus dependencias externas: qué asume de cada contrato con el que interactúa y qué ocurre si ese contrato se comporta de forma inesperada o maliciosa.</w:t>
             </w:r>
           </w:p>
         </w:tc>
@@ -1885,7 +2040,7 @@
       <w:tr>
         <w:tc>
           <w:tcPr>
-            <w:tcW w:type="dxa" w:w="2448"/>
+            <w:tcW w:type="dxa" w:w="1944"/>
             <w:tcMar>
               <w:top w:w="60" w:type="dxa"/>
               <w:bottom w:w="60" w:type="dxa"/>
@@ -1898,7 +2053,7 @@
               <w:rPr>
                 <w:b/>
                 <w:color w:val="102A43"/>
-                <w:sz w:val="19"/>
+                <w:sz w:val="17"/>
               </w:rPr>
               <w:t>SignatureHunter</w:t>
             </w:r>
@@ -1906,7 +2061,7 @@
         </w:tc>
         <w:tc>
           <w:tcPr>
-            <w:tcW w:type="dxa" w:w="5760"/>
+            <w:tcW w:type="dxa" w:w="1512"/>
             <w:tcMar>
               <w:top w:w="60" w:type="dxa"/>
               <w:bottom w:w="60" w:type="dxa"/>
@@ -1917,9 +2072,28 @@
           <w:p>
             <w:r>
               <w:rPr>
-                <w:sz w:val="19"/>
+                <w:sz w:val="17"/>
               </w:rPr>
-              <w:t>Replay de firmas, validación de firmas, nonces</w:t>
+              <w:t>—</w:t>
+            </w:r>
+          </w:p>
+        </w:tc>
+        <w:tc>
+          <w:tcPr>
+            <w:tcW w:type="dxa" w:w="4752"/>
+            <w:tcMar>
+              <w:top w:w="60" w:type="dxa"/>
+              <w:bottom w:w="60" w:type="dxa"/>
+              <w:start w:w="100" w:type="dxa"/>
+              <w:end w:w="100" w:type="dxa"/>
+            </w:tcMar>
+          </w:tcPr>
+          <w:p>
+            <w:r>
+              <w:rPr>
+                <w:sz w:val="17"/>
+              </w:rPr>
+              <w:t>Se centra en la criptografía aplicada: replay de firmas entre contextos o cadenas, validación incorrecta de firmas, gestión de nonces y vencimientos (deadlines).</w:t>
             </w:r>
           </w:p>
         </w:tc>
@@ -1927,7 +2101,7 @@
       <w:tr>
         <w:tc>
           <w:tcPr>
-            <w:tcW w:type="dxa" w:w="2448"/>
+            <w:tcW w:type="dxa" w:w="1944"/>
             <w:tcMar>
               <w:top w:w="60" w:type="dxa"/>
               <w:bottom w:w="60" w:type="dxa"/>
@@ -1941,7 +2115,7 @@
               <w:rPr>
                 <w:b/>
                 <w:color w:val="102A43"/>
-                <w:sz w:val="19"/>
+                <w:sz w:val="17"/>
               </w:rPr>
               <w:t>DoSHunter</w:t>
             </w:r>
@@ -1949,7 +2123,7 @@
         </w:tc>
         <w:tc>
           <w:tcPr>
-            <w:tcW w:type="dxa" w:w="5760"/>
+            <w:tcW w:type="dxa" w:w="1512"/>
             <w:tcMar>
               <w:top w:w="60" w:type="dxa"/>
               <w:bottom w:w="60" w:type="dxa"/>
@@ -1961,9 +2135,29 @@
           <w:p>
             <w:r>
               <w:rPr>
-                <w:sz w:val="19"/>
+                <w:sz w:val="17"/>
               </w:rPr>
-              <w:t>Denegación de servicio, bloqueo permanente de fondos</w:t>
+              <w:t>—</w:t>
+            </w:r>
+          </w:p>
+        </w:tc>
+        <w:tc>
+          <w:tcPr>
+            <w:tcW w:type="dxa" w:w="4752"/>
+            <w:tcMar>
+              <w:top w:w="60" w:type="dxa"/>
+              <w:bottom w:w="60" w:type="dxa"/>
+              <w:start w:w="100" w:type="dxa"/>
+              <w:end w:w="100" w:type="dxa"/>
+            </w:tcMar>
+            <w:shd w:val="clear" w:color="auto" w:fill="EAF1F8"/>
+          </w:tcPr>
+          <w:p>
+            <w:r>
+              <w:rPr>
+                <w:sz w:val="17"/>
+              </w:rPr>
+              <w:t>Busca denegación de servicio: rutas que pueden bloquearse de forma permanente, fondos que quedan atrapados sin posibilidad de recuperación, y operaciones que un atacante puede encarecer hasta hacerlas inviables.</w:t>
             </w:r>
           </w:p>
         </w:tc>
@@ -1971,7 +2165,7 @@
       <w:tr>
         <w:tc>
           <w:tcPr>
-            <w:tcW w:type="dxa" w:w="2448"/>
+            <w:tcW w:type="dxa" w:w="1944"/>
             <w:tcMar>
               <w:top w:w="60" w:type="dxa"/>
               <w:bottom w:w="60" w:type="dxa"/>
@@ -1984,7 +2178,7 @@
               <w:rPr>
                 <w:b/>
                 <w:color w:val="102A43"/>
-                <w:sz w:val="19"/>
+                <w:sz w:val="17"/>
               </w:rPr>
               <w:t>LogicHunter</w:t>
             </w:r>
@@ -1992,7 +2186,7 @@
         </w:tc>
         <w:tc>
           <w:tcPr>
-            <w:tcW w:type="dxa" w:w="5760"/>
+            <w:tcW w:type="dxa" w:w="1512"/>
             <w:tcMar>
               <w:top w:w="60" w:type="dxa"/>
               <w:bottom w:w="60" w:type="dxa"/>
@@ -2003,9 +2197,28 @@
           <w:p>
             <w:r>
               <w:rPr>
-                <w:sz w:val="19"/>
+                <w:sz w:val="17"/>
               </w:rPr>
-              <w:t>Errores de lógica de negocio y máquinas de estado</w:t>
+              <w:t>—</w:t>
+            </w:r>
+          </w:p>
+        </w:tc>
+        <w:tc>
+          <w:tcPr>
+            <w:tcW w:type="dxa" w:w="4752"/>
+            <w:tcMar>
+              <w:top w:w="60" w:type="dxa"/>
+              <w:bottom w:w="60" w:type="dxa"/>
+              <w:start w:w="100" w:type="dxa"/>
+              <w:end w:w="100" w:type="dxa"/>
+            </w:tcMar>
+          </w:tcPr>
+          <w:p>
+            <w:r>
+              <w:rPr>
+                <w:sz w:val="17"/>
+              </w:rPr>
+              <w:t>Caza errores de lógica de negocio y de máquina de estado: transiciones inválidas, suposiciones incorrectas sobre el orden de las operaciones y casos límite no contemplados por el diseño.</w:t>
             </w:r>
           </w:p>
         </w:tc>
@@ -2013,7 +2226,7 @@
       <w:tr>
         <w:tc>
           <w:tcPr>
-            <w:tcW w:type="dxa" w:w="2448"/>
+            <w:tcW w:type="dxa" w:w="1944"/>
             <w:tcMar>
               <w:top w:w="60" w:type="dxa"/>
               <w:bottom w:w="60" w:type="dxa"/>
@@ -2027,7 +2240,7 @@
               <w:rPr>
                 <w:b/>
                 <w:color w:val="102A43"/>
-                <w:sz w:val="19"/>
+                <w:sz w:val="17"/>
               </w:rPr>
               <w:t>AdversarialHunter</w:t>
             </w:r>
@@ -2035,7 +2248,7 @@
         </w:tc>
         <w:tc>
           <w:tcPr>
-            <w:tcW w:type="dxa" w:w="5760"/>
+            <w:tcW w:type="dxa" w:w="1512"/>
             <w:tcMar>
               <w:top w:w="60" w:type="dxa"/>
               <w:bottom w:w="60" w:type="dxa"/>
@@ -2047,9 +2260,29 @@
           <w:p>
             <w:r>
               <w:rPr>
-                <w:sz w:val="19"/>
+                <w:sz w:val="17"/>
               </w:rPr>
-              <w:t>Pensamiento de atacante con capital real y motivación</w:t>
+              <w:t>—</w:t>
+            </w:r>
+          </w:p>
+        </w:tc>
+        <w:tc>
+          <w:tcPr>
+            <w:tcW w:type="dxa" w:w="4752"/>
+            <w:tcMar>
+              <w:top w:w="60" w:type="dxa"/>
+              <w:bottom w:w="60" w:type="dxa"/>
+              <w:start w:w="100" w:type="dxa"/>
+              <w:end w:w="100" w:type="dxa"/>
+            </w:tcMar>
+            <w:shd w:val="clear" w:color="auto" w:fill="EAF1F8"/>
+          </w:tcPr>
+          <w:p>
+            <w:r>
+              <w:rPr>
+                <w:sz w:val="17"/>
+              </w:rPr>
+              <w:t>Adopta la mentalidad de un atacante con capital real y motivación: no busca patrones de catálogo, sino la combinación de acciones más rentable para romper el protocolo, por exótica que sea.</w:t>
             </w:r>
           </w:p>
         </w:tc>
@@ -2057,7 +2290,7 @@
       <w:tr>
         <w:tc>
           <w:tcPr>
-            <w:tcW w:type="dxa" w:w="2448"/>
+            <w:tcW w:type="dxa" w:w="1944"/>
             <w:tcMar>
               <w:top w:w="60" w:type="dxa"/>
               <w:bottom w:w="60" w:type="dxa"/>
@@ -2070,7 +2303,7 @@
               <w:rPr>
                 <w:b/>
                 <w:color w:val="102A43"/>
-                <w:sz w:val="19"/>
+                <w:sz w:val="17"/>
               </w:rPr>
               <w:t>LibraryHunter</w:t>
             </w:r>
@@ -2078,7 +2311,7 @@
         </w:tc>
         <w:tc>
           <w:tcPr>
-            <w:tcW w:type="dxa" w:w="5760"/>
+            <w:tcW w:type="dxa" w:w="1512"/>
             <w:tcMar>
               <w:top w:w="60" w:type="dxa"/>
               <w:bottom w:w="60" w:type="dxa"/>
@@ -2089,9 +2322,28 @@
           <w:p>
             <w:r>
               <w:rPr>
-                <w:sz w:val="19"/>
+                <w:sz w:val="17"/>
               </w:rPr>
-              <w:t>Vulnerabilidades en librerías y código reutilizado</w:t>
+              <w:t>—</w:t>
+            </w:r>
+          </w:p>
+        </w:tc>
+        <w:tc>
+          <w:tcPr>
+            <w:tcW w:type="dxa" w:w="4752"/>
+            <w:tcMar>
+              <w:top w:w="60" w:type="dxa"/>
+              <w:bottom w:w="60" w:type="dxa"/>
+              <w:start w:w="100" w:type="dxa"/>
+              <w:end w:w="100" w:type="dxa"/>
+            </w:tcMar>
+          </w:tcPr>
+          <w:p>
+            <w:r>
+              <w:rPr>
+                <w:sz w:val="17"/>
+              </w:rPr>
+              <w:t>Audita las librerías y el código reutilizado, donde los fallos heredados pasan desapercibidos por darse por “probados”. Patrones: bugs conocidos en versiones de librerías, mal uso de utilidades.</w:t>
             </w:r>
           </w:p>
         </w:tc>
@@ -2099,7 +2351,7 @@
       <w:tr>
         <w:tc>
           <w:tcPr>
-            <w:tcW w:type="dxa" w:w="2448"/>
+            <w:tcW w:type="dxa" w:w="1944"/>
             <w:tcMar>
               <w:top w:w="60" w:type="dxa"/>
               <w:bottom w:w="60" w:type="dxa"/>
@@ -2113,7 +2365,7 @@
               <w:rPr>
                 <w:b/>
                 <w:color w:val="102A43"/>
-                <w:sz w:val="19"/>
+                <w:sz w:val="17"/>
               </w:rPr>
               <w:t>WildcardHunter</w:t>
             </w:r>
@@ -2121,7 +2373,7 @@
         </w:tc>
         <w:tc>
           <w:tcPr>
-            <w:tcW w:type="dxa" w:w="5760"/>
+            <w:tcW w:type="dxa" w:w="1512"/>
             <w:tcMar>
               <w:top w:w="60" w:type="dxa"/>
               <w:bottom w:w="60" w:type="dxa"/>
@@ -2133,9 +2385,29 @@
           <w:p>
             <w:r>
               <w:rPr>
-                <w:sz w:val="19"/>
+                <w:sz w:val="17"/>
               </w:rPr>
-              <w:t>Lo que nadie documentó antes — hipótesis novedosas sin filtrar por probabilidad</w:t>
+              <w:t>Sin referente</w:t>
+            </w:r>
+          </w:p>
+        </w:tc>
+        <w:tc>
+          <w:tcPr>
+            <w:tcW w:type="dxa" w:w="4752"/>
+            <w:tcMar>
+              <w:top w:w="60" w:type="dxa"/>
+              <w:bottom w:w="60" w:type="dxa"/>
+              <w:start w:w="100" w:type="dxa"/>
+              <w:end w:w="100" w:type="dxa"/>
+            </w:tcMar>
+            <w:shd w:val="clear" w:color="auto" w:fill="EAF1F8"/>
+          </w:tcPr>
+          <w:p>
+            <w:r>
+              <w:rPr>
+                <w:sz w:val="17"/>
+              </w:rPr>
+              <w:t>Su misión es encontrar lo que nadie documentó antes. Recibe la lista de hipótesis ya generadas para no repetir y piensa de forma libre. Sus hipótesis se etiquetan como “novedosas” y NUNCA se descartan por baja probabilidad.</w:t>
             </w:r>
           </w:p>
         </w:tc>
@@ -2162,6 +2434,18 @@
     </w:p>
     <w:p>
       <w:pPr>
+        <w:spacing w:after="80"/>
+      </w:pPr>
+      <w:r>
+        <w:rPr>
+          <w:i w:val="0"/>
+          <w:sz w:val="21"/>
+        </w:rPr>
+        <w:t>Tras los 12 hunters en paralelo se ejecutan dos hunters de forma secuencial, porque necesitan consumir el trabajo de todos los anteriores.</w:t>
+      </w:r>
+    </w:p>
+    <w:p>
+      <w:pPr>
         <w:pStyle w:val="ListBullet"/>
         <w:spacing w:after="60"/>
       </w:pPr>
@@ -2173,7 +2457,7 @@
         <w:t xml:space="preserve">CrossChainHunter: </w:t>
       </w:r>
       <w:r>
-        <w:t>solo se activa si el componente está desplegado en dos o más cadenas. Busca replay de firmas, divergencia de configuración, desincronización de proxies y dependencias de estado cross-chain. Si el componente es de una sola cadena, se omite automáticamente.</w:t>
+        <w:t>solo se activa si el componente está desplegado en dos o más cadenas. Busca replay de firmas entre cadenas, divergencia de configuración, desincronización en actualizaciones de proxy y dependencias de estado cross-chain. Si el componente es de una sola cadena, se omite automáticamente.</w:t>
       </w:r>
     </w:p>
     <w:p>
@@ -2189,7 +2473,7 @@
         <w:t xml:space="preserve">DeepDiveHunter: </w:t>
       </w:r>
       <w:r>
-        <w:t>lee las convergencias de todos los hunters anteriores y genera hipótesis profundas, sin límite mínimo ni máximo. Puede ejecutarse en varias rondas con ángulos distintos. Es donde aparecen los hallazgos más sofisticados.</w:t>
+        <w:t>lee las convergencias de todos los hunters anteriores y genera hipótesis profundas, sin límite mínimo ni máximo. Puede ejecutarse en varias rondas con ángulos distintos. Prioriza calidad sobre cantidad, pero nunca corta el análisis de forma artificial. Es donde aparecen los hallazgos más sofisticados, los que los auditores anteriores pasaron por alto.</w:t>
       </w:r>
     </w:p>
     <w:tbl>
@@ -2224,7 +2508,7 @@
                 <w:color w:val="102A43"/>
                 <w:sz w:val="22"/>
               </w:rPr>
-              <w:t>Filosofía de cada hunter</w:t>
+              <w:t>Por qué referentes reales</w:t>
             </w:r>
           </w:p>
           <w:p>
@@ -2235,7 +2519,7 @@
               <w:rPr>
                 <w:sz w:val="20"/>
               </w:rPr>
-              <w:t>Cada hunter está calibrado con la metodología de un referente real del sector (por ejemplo, samczsun para oráculos y reentrancy, Mudit Gupta para control de acceso, Trust para matemáticas). Antes de emitir una hipótesis, cada agente aplica un auto-filtro: “¿por qué estaría equivocado?”. Esto reduce el ruido en origen.</w:t>
+              <w:t>Calibrar cada hunter con la metodología de un experto reconocido (samczsun para oráculos y reentrancy, Mudit Gupta para control de acceso, Trust para matemáticas) traslada conocimiento tácito difícil de codificar de otra forma. El sistema replica así, en paralelo, a un panel de especialistas que ningún equipo humano podría reunir a la vez sobre un mismo objetivo.</w:t>
             </w:r>
           </w:p>
         </w:tc>
@@ -2255,7 +2539,7 @@
           <w:i w:val="0"/>
           <w:sz w:val="21"/>
         </w:rPr>
-        <w:t>Las hipótesis se priorizan con una fórmula simple —severidad si es cierta × confianza × (1 / esfuerzo)— y las que cruzan varios componentes reciben prioridad alta, porque ahí es donde viven los hallazgos críticos que los auditores anteriores pasaron por alto.</w:t>
+        <w:t>Las hipótesis de los 14 hunters se priorizan con una fórmula simple —severidad si es cierta × confianza × (1 / esfuerzo)— y las que cruzan varios componentes reciben prioridad alta, porque ahí es donde viven los hallazgos de mayor severidad.</w:t>
       </w:r>
     </w:p>
     <w:p>

</xml_diff>